<commit_message>
publish student projects (Fall 2026) 2026-09-22 19:47
</commit_message>
<xml_diff>
--- a/Games/rbr-room-bot-rumble.docx
+++ b/Games/rbr-room-bot-rumble.docx
@@ -2512,13 +2512,13 @@
         <w:rPr>
           <w:b/>
         </w:rPr>
-        <w:t xml:space="preserve">Recommended composition:</w:t>
-      </w:r>
-      <w:r>
-        <w:t xml:space="preserve"> </w:t>
-      </w:r>
-      <w:r>
-        <w:t xml:space="preserve">6 CS + 2 Design + 1 Art (9) — a bot-builder auto-battler is a</w:t>
+        <w:t xml:space="preserve">Team composition (set by instructor):</w:t>
+      </w:r>
+      <w:r>
+        <w:t xml:space="preserve"> </w:t>
+      </w:r>
+      <w:r>
+        <w:t xml:space="preserve">6 CS + 1 Design + 0 Art (7) — a bot-builder auto-battler is a</w:t>
       </w:r>
       <w:r>
         <w:t xml:space="preserve"> </w:t>
@@ -2533,22 +2533,52 @@
         <w:t xml:space="preserve"> </w:t>
       </w:r>
       <w:r>
-        <w:t xml:space="preserve">game, so the design surface is large (the stat/point economy, the gadget/weapon behaviours, the FSM behaviour design, the rating/matchmaking and combat balance), fitting two designers; one artist can carry a</w:t>
-      </w:r>
-      <w:r>
-        <w:t xml:space="preserve"> </w:t>
-      </w:r>
-      <w:r>
-        <w:rPr>
-          <w:b/>
-        </w:rPr>
-        <w:t xml:space="preserve">modular, combinatorial</w:t>
-      </w:r>
-      <w:r>
-        <w:t xml:space="preserve"> </w:t>
-      </w:r>
-      <w:r>
-        <w:t xml:space="preserve">bot look (chassis + interchangeable gadgets/weapons parts), the single world map, projectiles/paint-trail VFX and the builder UI (rules: min 1 Design mandated, max 9 total, D+A ≤ 3; see</w:t>
+        <w:t xml:space="preserve">game with a large design surface (the stat/point economy, the gadget/weapon behaviours, the FSM behaviour design, the rating/matchmaking and combat balance), and with</w:t>
+      </w:r>
+      <w:r>
+        <w:t xml:space="preserve"> </w:t>
+      </w:r>
+      <w:r>
+        <w:rPr>
+          <w:b/>
+        </w:rPr>
+        <w:t xml:space="preserve">no artist</w:t>
+      </w:r>
+      <w:r>
+        <w:t xml:space="preserve"> </w:t>
+      </w:r>
+      <w:r>
+        <w:t xml:space="preserve">the single designer owns all of that Design + UI/UX</w:t>
+      </w:r>
+      <w:r>
+        <w:t xml:space="preserve"> </w:t>
+      </w:r>
+      <w:r>
+        <w:rPr>
+          <w:i/>
+        </w:rPr>
+        <w:t xml:space="preserve">and</w:t>
+      </w:r>
+      <w:r>
+        <w:t xml:space="preserve"> </w:t>
+      </w:r>
+      <w:r>
+        <w:t xml:space="preserve">takes the</w:t>
+      </w:r>
+      <w:r>
+        <w:t xml:space="preserve"> </w:t>
+      </w:r>
+      <w:r>
+        <w:rPr>
+          <w:b/>
+        </w:rPr>
+        <w:t xml:space="preserve">D11 conditional</w:t>
+      </w:r>
+      <w:r>
+        <w:t xml:space="preserve"> </w:t>
+      </w:r>
+      <w:r>
+        <w:t xml:space="preserve">as a real graded Design goal each milestone (M1 Art Proof of Concept / M2 Art Implementation Quality — the last Design goal each milestone), which consumes one Design+UI slot per milestone (rules: min 1 Design mandated, max 9 total, D+A ≤ 3; see</w:t>
       </w:r>
       <w:r>
         <w:t xml:space="preserve"> </w:t>
@@ -2560,7 +2590,37 @@
         <w:t xml:space="preserve">team-formation.pdf</w:t>
       </w:r>
       <w:r>
-        <w:t xml:space="preserve">). If the modular-part art volume outgrows one artist, trade the 2nd designer for a 2nd artist.</w:t>
+        <w:t xml:space="preserve">).</w:t>
+      </w:r>
+      <w:r>
+        <w:t xml:space="preserve"> </w:t>
+      </w:r>
+      <w:r>
+        <w:rPr>
+          <w:b/>
+        </w:rPr>
+        <w:t xml:space="preserve">Load + art-risk flag:</w:t>
+      </w:r>
+      <w:r>
+        <w:t xml:space="preserve"> </w:t>
+      </w:r>
+      <w:r>
+        <w:t xml:space="preserve">this is a heavy squeeze — the systems/balance design load is large for one designer, and the modular bot parts + arena + paint-trail/projectile VFX + builder UI are a real art surface, so 0 artists is a serious risk. Strongly consider a</w:t>
+      </w:r>
+      <w:r>
+        <w:t xml:space="preserve"> </w:t>
+      </w:r>
+      <w:r>
+        <w:rPr>
+          <w:b/>
+        </w:rPr>
+        <w:t xml:space="preserve">2nd designer</w:t>
+      </w:r>
+      <w:r>
+        <w:t xml:space="preserve"> </w:t>
+      </w:r>
+      <w:r>
+        <w:t xml:space="preserve">and/or an artist within the D+A ≤ 3 cap; if the team stays 6 CS + 1 Design + 0 Art, scope the module set hard and lean on a reusable modular style under D11 (a solo designer + 0 artists is the case the design pool flags, and squeezes the designer's systems/balance goals).</w:t>
       </w:r>
       <w:r>
         <w:t xml:space="preserve"> </w:t>
@@ -2658,31 +2718,7 @@
         <w:pStyle w:val="Compact"/>
       </w:pPr>
       <w:r>
-        <w:t xml:space="preserve">M1D3 User Research, Personas &amp; Competitive Analysis (teardown of Gladiabots / Super Auto Pets / Robocraft; findings into the FDD)</w:t>
-      </w:r>
-    </w:p>
-    <w:p>
-      <w:pPr>
-        <w:numPr>
-          <w:ilvl w:val="1"/>
-          <w:numId w:val="1018"/>
-        </w:numPr>
-        <w:pStyle w:val="Compact"/>
-      </w:pPr>
-      <w:r>
-        <w:t xml:space="preserve">M1D5 Level &amp; Progression Design (the rating/ranking progression and unlock pacing of gadgets/stats)</w:t>
-      </w:r>
-    </w:p>
-    <w:p>
-      <w:pPr>
-        <w:numPr>
-          <w:ilvl w:val="1"/>
-          <w:numId w:val="1018"/>
-        </w:numPr>
-        <w:pStyle w:val="Compact"/>
-      </w:pPr>
-      <w:r>
-        <w:t xml:space="preserve">M1D6 Systems &amp; Economy Design (the point-allocation stat economy, the gadget/weapon behaviours and the scoring — every system with a purpose)</w:t>
+        <w:t xml:space="preserve">M1D11 Art Proof of Concept *(conditional — no artist; Design-owned)* — the visual direction: the modular bot look (chassis + interchangeable gadgets/weapons), the arena, the projectile/paint-trail VFX and the builder UI; 2 mockups. *(The artist's absence + the drop to one designer squeeze out the M1D3/D5/D6 goals.)*</w:t>
       </w:r>
     </w:p>
     <w:p>
@@ -2721,31 +2757,7 @@
         <w:pStyle w:val="Compact"/>
       </w:pPr>
       <w:r>
-        <w:t xml:space="preserve">M2D3 Systems Balance &amp; Tuning — Data-Driven (stat/gadget balance and matchmaking/rating tuning via the team's JSON, no code changes)</w:t>
-      </w:r>
-    </w:p>
-    <w:p>
-      <w:pPr>
-        <w:numPr>
-          <w:ilvl w:val="1"/>
-          <w:numId w:val="1019"/>
-        </w:numPr>
-        <w:pStyle w:val="Compact"/>
-      </w:pPr>
-      <w:r>
-        <w:t xml:space="preserve">M2D5 Playtesting &amp; Iteration Program (test build variety and fight readability, triage, re-test)</w:t>
-      </w:r>
-    </w:p>
-    <w:p>
-      <w:pPr>
-        <w:numPr>
-          <w:ilvl w:val="1"/>
-          <w:numId w:val="1019"/>
-        </w:numPr>
-        <w:pStyle w:val="Compact"/>
-      </w:pPr>
-      <w:r>
-        <w:t xml:space="preserve">M2D6 Progression &amp; Retention Tuning (the rating ladder pacing and unlock cadence, kept fair and non-grindy)</w:t>
+        <w:t xml:space="preserve">M2D11 Art Implementation Quality *(conditional — no artist; Design-owned)* — the modular bot parts, the arena, projectiles/paint-trail VFX and the builder UI implemented in-engine, no placeholders.</w:t>
       </w:r>
     </w:p>
     <w:p>
@@ -2784,30 +2796,6 @@
     <w:p>
       <w:pPr>
         <w:numPr>
-          <w:ilvl w:val="1"/>
-          <w:numId w:val="1020"/>
-        </w:numPr>
-        <w:pStyle w:val="Compact"/>
-      </w:pPr>
-      <w:r>
-        <w:t xml:space="preserve">M1U2 UX Flows &amp; Wireframes — Menus → HUD — the build → submit → watch → rating flow wireframed end to end.</w:t>
-      </w:r>
-    </w:p>
-    <w:p>
-      <w:pPr>
-        <w:numPr>
-          <w:ilvl w:val="1"/>
-          <w:numId w:val="1020"/>
-        </w:numPr>
-        <w:pStyle w:val="Compact"/>
-      </w:pPr>
-      <w:r>
-        <w:t xml:space="preserve">M1U3 Accessibility &amp; Readability Foundations — legible stats/behaviour cues, contrast and touch targets on a phone.</w:t>
-      </w:r>
-    </w:p>
-    <w:p>
-      <w:pPr>
-        <w:numPr>
           <w:ilvl w:val="0"/>
           <w:numId w:val="1017"/>
         </w:numPr>
@@ -2847,30 +2835,6 @@
     <w:p>
       <w:pPr>
         <w:numPr>
-          <w:ilvl w:val="1"/>
-          <w:numId w:val="1021"/>
-        </w:numPr>
-        <w:pStyle w:val="Compact"/>
-      </w:pPr>
-      <w:r>
-        <w:t xml:space="preserve">M2U3 Menu &amp; HUD Motion Design — build-confirm, combat-start, score and rating-update transitions animated so state reads clearly.</w:t>
-      </w:r>
-    </w:p>
-    <w:p>
-      <w:pPr>
-        <w:numPr>
-          <w:ilvl w:val="1"/>
-          <w:numId w:val="1021"/>
-        </w:numPr>
-        <w:pStyle w:val="Compact"/>
-      </w:pPr>
-      <w:r>
-        <w:t xml:space="preserve">M2U4 Onboarding &amp; Tutorial Design — teach build → attach → stats → watch → rate in the first session without a wall of text.</w:t>
-      </w:r>
-    </w:p>
-    <w:p>
-      <w:pPr>
-        <w:numPr>
           <w:ilvl w:val="0"/>
           <w:numId w:val="1017"/>
         </w:numPr>
@@ -2880,49 +2844,13 @@
         <w:rPr>
           <w:b/>
         </w:rPr>
-        <w:t xml:space="preserve">Art M1:</w:t>
-      </w:r>
-      <w:r>
-        <w:t xml:space="preserve"> </w:t>
-      </w:r>
-      <w:r>
-        <w:t xml:space="preserve">1 artist (modular combinatorial bot parts + world + UI + VFX)</w:t>
-      </w:r>
-    </w:p>
-    <w:p>
-      <w:pPr>
-        <w:numPr>
-          <w:ilvl w:val="1"/>
-          <w:numId w:val="1022"/>
-        </w:numPr>
-        <w:pStyle w:val="Compact"/>
-      </w:pPr>
-      <w:r>
-        <w:t xml:space="preserve">M1A1 ⭐ Art Bible / Proof of Concept (the visual direction — the "cleaning bot" tone, the modular-part language, readability of gadgets/weapons)</w:t>
-      </w:r>
-    </w:p>
-    <w:p>
-      <w:pPr>
-        <w:numPr>
-          <w:ilvl w:val="1"/>
-          <w:numId w:val="1022"/>
-        </w:numPr>
-        <w:pStyle w:val="Compact"/>
-      </w:pPr>
-      <w:r>
-        <w:t xml:space="preserve">M1A2 Character Concepts &amp; Model Sheets (the bot chassis + the interchangeable gadgets/weapons as a modular set)</w:t>
-      </w:r>
-    </w:p>
-    <w:p>
-      <w:pPr>
-        <w:numPr>
-          <w:ilvl w:val="1"/>
-          <w:numId w:val="1022"/>
-        </w:numPr>
-        <w:pStyle w:val="Compact"/>
-      </w:pPr>
-      <w:r>
-        <w:t xml:space="preserve">M1A4 UI Art Concepts &amp; Typography (the builder screen, stat allocation, combat HUD, leaderboard)</w:t>
+        <w:t xml:space="preserve">Art:</w:t>
+      </w:r>
+      <w:r>
+        <w:t xml:space="preserve"> </w:t>
+      </w:r>
+      <w:r>
+        <w:t xml:space="preserve">0 artists — the art surface (the modular bot parts — chassis + interchangeable gadgets/weapons — the arena/world map, the projectile/paint-trail VFX and the builder UI) is covered by the D11 conditionals, taken as Design goals by the single designer (see Design M1/M2). A modular bot-builder is genuinely art-forward, so 0 artists is a serious risk — scope the module set hard and lean on a reusable modular style.</w:t>
       </w:r>
     </w:p>
     <w:p>
@@ -2937,43 +2865,31 @@
         <w:rPr>
           <w:b/>
         </w:rPr>
-        <w:t xml:space="preserve">Art M2:</w:t>
-      </w:r>
-    </w:p>
-    <w:p>
-      <w:pPr>
-        <w:numPr>
-          <w:ilvl w:val="1"/>
-          <w:numId w:val="1023"/>
-        </w:numPr>
-        <w:pStyle w:val="Compact"/>
-      </w:pPr>
-      <w:r>
-        <w:t xml:space="preserve">M2A1 ⭐ Critical Asset Production &amp; In-Engine Visual Quality (the bot parts, world map, projectiles and UI implemented and consistent)</w:t>
-      </w:r>
-    </w:p>
-    <w:p>
-      <w:pPr>
-        <w:numPr>
-          <w:ilvl w:val="1"/>
-          <w:numId w:val="1023"/>
-        </w:numPr>
-        <w:pStyle w:val="Compact"/>
-      </w:pPr>
-      <w:r>
-        <w:t xml:space="preserve">M2A2 Character Animation — Extensive (bot movement, gadget/weapon firing, hit/destroy reactions)</w:t>
-      </w:r>
-    </w:p>
-    <w:p>
-      <w:pPr>
-        <w:numPr>
-          <w:ilvl w:val="1"/>
-          <w:numId w:val="1023"/>
-        </w:numPr>
-        <w:pStyle w:val="Compact"/>
-      </w:pPr>
-      <w:r>
-        <w:t xml:space="preserve">M2A5 VFX — Critical Effects &amp; Transitions (the paint trail, weapon/gadget effects, projectile impacts and the destroy moment)</w:t>
+        <w:t xml:space="preserve">TEAM M1:</w:t>
+      </w:r>
+    </w:p>
+    <w:p>
+      <w:pPr>
+        <w:numPr>
+          <w:ilvl w:val="1"/>
+          <w:numId w:val="1022"/>
+        </w:numPr>
+        <w:pStyle w:val="Compact"/>
+      </w:pPr>
+      <w:r>
+        <w:t xml:space="preserve">M1TA1 ⭐ Overall Audio Experience — initial BGM/SFX from the week-5 needs list present &amp; working in the prototype (workshop/arena BGM, build-confirm, weapon-fire, hit, and destroy cues), suitable and correctly triggered.</w:t>
+      </w:r>
+    </w:p>
+    <w:p>
+      <w:pPr>
+        <w:numPr>
+          <w:ilvl w:val="1"/>
+          <w:numId w:val="1022"/>
+        </w:numPr>
+        <w:pStyle w:val="Compact"/>
+      </w:pPr>
+      <w:r>
+        <w:t xml:space="preserve">M1TA2 ⭐ Audio Engine Functionality — the team's data-driven audio pipeline (add/replace files without recompiling) + reliable multi-channel playback for overlapping combat SFX.</w:t>
       </w:r>
     </w:p>
     <w:p>
@@ -2988,45 +2904,6 @@
         <w:rPr>
           <w:b/>
         </w:rPr>
-        <w:t xml:space="preserve">TEAM M1:</w:t>
-      </w:r>
-    </w:p>
-    <w:p>
-      <w:pPr>
-        <w:numPr>
-          <w:ilvl w:val="1"/>
-          <w:numId w:val="1024"/>
-        </w:numPr>
-        <w:pStyle w:val="Compact"/>
-      </w:pPr>
-      <w:r>
-        <w:t xml:space="preserve">M1TA1 ⭐ Overall Audio Experience — initial BGM/SFX from the week-5 needs list present &amp; working in the prototype (workshop/arena BGM, build-confirm, weapon-fire, hit, and destroy cues), suitable and correctly triggered.</w:t>
-      </w:r>
-    </w:p>
-    <w:p>
-      <w:pPr>
-        <w:numPr>
-          <w:ilvl w:val="1"/>
-          <w:numId w:val="1024"/>
-        </w:numPr>
-        <w:pStyle w:val="Compact"/>
-      </w:pPr>
-      <w:r>
-        <w:t xml:space="preserve">M1TA2 ⭐ Audio Engine Functionality — the team's data-driven audio pipeline (add/replace files without recompiling) + reliable multi-channel playback for overlapping combat SFX.</w:t>
-      </w:r>
-    </w:p>
-    <w:p>
-      <w:pPr>
-        <w:numPr>
-          <w:ilvl w:val="0"/>
-          <w:numId w:val="1017"/>
-        </w:numPr>
-        <w:pStyle w:val="Compact"/>
-      </w:pPr>
-      <w:r>
-        <w:rPr>
-          <w:b/>
-        </w:rPr>
         <w:t xml:space="preserve">TEAM M2:</w:t>
       </w:r>
     </w:p>
@@ -3034,7 +2911,7 @@
       <w:pPr>
         <w:numPr>
           <w:ilvl w:val="1"/>
-          <w:numId w:val="1025"/>
+          <w:numId w:val="1023"/>
         </w:numPr>
         <w:pStyle w:val="Compact"/>
       </w:pPr>
@@ -3046,7 +2923,7 @@
       <w:pPr>
         <w:numPr>
           <w:ilvl w:val="1"/>
-          <w:numId w:val="1025"/>
+          <w:numId w:val="1023"/>
         </w:numPr>
         <w:pStyle w:val="Compact"/>
       </w:pPr>
@@ -3058,7 +2935,7 @@
       <w:pPr>
         <w:numPr>
           <w:ilvl w:val="1"/>
-          <w:numId w:val="1025"/>
+          <w:numId w:val="1023"/>
         </w:numPr>
         <w:pStyle w:val="Compact"/>
       </w:pPr>
@@ -3403,12 +3280,6 @@
     <w:abstractNumId w:val="991"/>
   </w:num>
   <w:num w:numId="1023">
-    <w:abstractNumId w:val="991"/>
-  </w:num>
-  <w:num w:numId="1024">
-    <w:abstractNumId w:val="991"/>
-  </w:num>
-  <w:num w:numId="1025">
     <w:abstractNumId w:val="991"/>
   </w:num>
 </w:numbering>

</xml_diff>